<commit_message>
docs: update project description and real metadata
</commit_message>
<xml_diff>
--- a/docs/FAS_项目公开版说明.docx
+++ b/docs/FAS_项目公开版说明.docx
@@ -13,7 +13,7 @@
           <w:b/>
           <w:sz w:val="32"/>
         </w:rPr>
-        <w:t>面向身份认证的人脸呈现攻击检测系统（毕设项目公开版文档）</w:t>
+        <w:t>面向身份认证的人脸呈现攻击检测系统项目说明</w:t>
       </w:r>
     </w:p>
     <w:p>
@@ -52,7 +52,7 @@
           <w:b w:val="0"/>
           <w:sz w:val="24"/>
         </w:rPr>
-        <w:t>开源地址：待上传至 GitHub 仓库（本次整理版本）</w:t>
+        <w:t>开源地址：https://github.com/cp3wangyue/FAS_Train</w:t>
       </w:r>
     </w:p>
     <w:p>
@@ -78,7 +78,20 @@
           <w:b w:val="0"/>
           <w:sz w:val="24"/>
         </w:rPr>
-        <w:t>作者信息：公开版文档已隐藏个人学号、电话、照片、论文正文与其他敏感身份信息。</w:t>
+        <w:t>作者信息：董博洹，学号：2020103560，网络空间安全专业，网络空间安全学院</w:t>
+      </w:r>
+    </w:p>
+    <w:p>
+      <w:pPr>
+        <w:spacing w:after="80"/>
+      </w:pPr>
+      <w:r>
+        <w:rPr>
+          <w:rFonts w:ascii="宋体" w:hAnsi="宋体" w:eastAsia="宋体"/>
+          <w:b w:val="0"/>
+          <w:sz w:val="24"/>
+        </w:rPr>
+        <w:t>指导教师：吴小天</w:t>
       </w:r>
     </w:p>
     <w:p>
@@ -92,7 +105,7 @@
           <w:b w:val="0"/>
           <w:sz w:val="24"/>
         </w:rPr>
-        <w:t>项目简介：本项目面向身份认证场景，围绕照片攻击、屏幕翻拍等常见呈现攻击形式，设计并实现了一个轻量级人脸防伪系统。系统采用 MobileNetV3-Small 作为主干网络，并通过分类分支与伪深度分支联合优化，使其能够在保持较低计算开销的同时兼顾检测精度与端侧实时性。</w:t>
+        <w:t>项目简介：本项目面向身份认证场景，围绕照片攻击、屏幕回放等常见呈现攻击形式，设计并实现了一套基于轻量级卷积神经网络的人脸呈现攻击检测系统。系统采用 MobileNetV3-Small 作为主干网络，并通过分类分支与伪深度分支联合优化，以增强对真实人脸纹理、攻击介质边缘和伪深度差异的综合判别能力。整个项目覆盖数据读取、模型训练、指标统计、ONNX 导出、摄像头实时推理和图形界面演示，能够支撑毕设实验、部署验证与答辩展示。</w:t>
       </w:r>
     </w:p>
     <w:p>
@@ -118,21 +131,7 @@
           <w:b w:val="0"/>
           <w:sz w:val="24"/>
         </w:rPr>
-        <w:t>代码规模：约 7152 行 Python 代码（按当前公开仓库脚本统计）</w:t>
-      </w:r>
-    </w:p>
-    <w:p>
-      <w:pPr>
-        <w:spacing w:after="80"/>
-        <w:ind w:firstLine="480"/>
-      </w:pPr>
-      <w:r>
-        <w:rPr>
-          <w:rFonts w:ascii="宋体" w:hAnsi="宋体" w:eastAsia="宋体"/>
-          <w:b w:val="0"/>
-          <w:sz w:val="24"/>
-        </w:rPr>
-        <w:t>公开说明：本仓库仅发布源码、部署说明与公开版项目文档，不包含 thesis 论文目录、个人照片采样数据、带人脸截图的实验日志或训练权重。</w:t>
+        <w:t>代码规模：约 7152 行 Python 代码</w:t>
       </w:r>
     </w:p>
     <w:p>
@@ -293,7 +292,7 @@
           <w:b w:val="0"/>
           <w:sz w:val="24"/>
         </w:rPr>
-        <w:t>说明：该图用于展示训练过程中准确率变化曲线，属于公开版实验结果图，不含个人隐私信息。</w:t>
+        <w:t>说明：图中展示了训练阶段的准确率变化情况，可用于说明模型训练链路与实验记录链路已经打通。</w:t>
       </w:r>
     </w:p>
     <w:p>
@@ -332,7 +331,7 @@
           <w:b w:val="0"/>
           <w:sz w:val="24"/>
         </w:rPr>
-        <w:t>2. 推理侧支持单图、批量与摄像头实时检测，并通过 GUI 展示 Attack/Genuine 概率、FPS 与亮度信息。</w:t>
+        <w:t>2. 推理侧支持单图、批量与摄像头实时检测，并通过 GUI 展示 Attack/Genuine 概率、FPS、亮度与伪深度图信息。</w:t>
       </w:r>
     </w:p>
     <w:p>
@@ -345,7 +344,7 @@
           <w:b w:val="0"/>
           <w:sz w:val="24"/>
         </w:rPr>
-        <w:t>3. 部署侧支持 ONNX Runtime + OpenCV + PyQt5 的轻量化演示链路，适合笔记本端验证与答辩展示。</w:t>
+        <w:t>3. 部署侧支持 ONNX Runtime + OpenCV + PyQt5 的轻量化演示链路，适合在普通笔记本环境中完成实时检测验证。</w:t>
       </w:r>
     </w:p>
     <w:sectPr>

</xml_diff>